<commit_message>
Kaynakca kitap/makale/rapor ve genel ag kaynakcasi olarak ikiye ayrildi
</commit_message>
<xml_diff>
--- a/kaynakca/Kimya11_kaynakca.docx
+++ b/kaynakca/Kimya11_kaynakca.docx
@@ -61,7 +61,7 @@
           <w:rFonts w:ascii="Times New Roman" w:hAnsi="Times New Roman" w:cs="Times New Roman"/>
           <w:lang w:val="tr-TR"/>
         </w:rPr>
-        <w:t xml:space="preserve">Burgess, Donald R. ve Anthony P. Hamins. Heats of Combustion and Related Properties of Pure Substances. NIST Technical Note 2126-upd1. Gaithersburg, MD: National Institute of Standards and Technology, 2026. https://doi.org/10.6028/NIST.TN.2126-upd1</w:t>
+        <w:t xml:space="preserve">Burgess, Donald R. ve Anthony P. Hamins. Heats of Combustion and Related Properties of Pure Substances. NIST Technical Note 2126-upd1. Gaithersburg, MD: National Institute of Standards and Technology, 2026.</w:t>
       </w:r>
     </w:p>
     <w:p>
@@ -82,7 +82,7 @@
           <w:rFonts w:ascii="Times New Roman" w:hAnsi="Times New Roman" w:cs="Times New Roman"/>
           <w:lang w:val="tr-TR"/>
         </w:rPr>
-        <w:t xml:space="preserve">Yazici, M. Suha. “UNIDO-ICHET Support to Hydrogen and Fuel Cell Technologies in Turkey”. International Journal of Hydrogen Energy 36, 17 (2011): 11239-11245. https://doi.org/10.1016/j.ijhydene.2010.11.120</w:t>
+        <w:t xml:space="preserve">Yazici, M. Suha. “UNIDO-ICHET Support to Hydrogen and Fuel Cell Technologies in Turkey”. International Journal of Hydrogen Energy 36, 17 (2011): 11239-11245.</w:t>
       </w:r>
     </w:p>
     <w:p>
@@ -103,7 +103,7 @@
           <w:rFonts w:ascii="Times New Roman" w:hAnsi="Times New Roman" w:cs="Times New Roman"/>
           <w:lang w:val="tr-TR"/>
         </w:rPr>
-        <w:t xml:space="preserve">International Organization for Standardization. ISO 80004-1:2023 Nanotechnologies – Vocabulary – Part 1: Core Vocabulary. Cenevre: ISO, 2023.</w:t>
+        <w:t xml:space="preserve">Arthur, Courtney, Joel Baker ve Holly Bamford, ed. Proceedings of the International Research Workshop on the Occurrence, Effects and Fate of Microplastic Marine Debris. NOAA Technical Memorandum NOS-OR&amp;R-30. Silver Spring, MD: NOAA, 2009.</w:t>
       </w:r>
     </w:p>
     <w:p>
@@ -124,7 +124,7 @@
           <w:rFonts w:ascii="Times New Roman" w:hAnsi="Times New Roman" w:cs="Times New Roman"/>
           <w:lang w:val="tr-TR"/>
         </w:rPr>
-        <w:t xml:space="preserve">Avrupa Komisyonu. “Commission Recommendation of 10 June 2022 on the Definition of Nanomaterial (2022/C 229/01)”. Official Journal of the European Union C 229 (2022).</w:t>
+        <w:t xml:space="preserve">Boucher, Julien ve Damien Friot. Primary Microplastics in the Oceans: A Global Evaluation of Sources. Gland, İsviçre: IUCN, 2017.</w:t>
       </w:r>
     </w:p>
     <w:p>
@@ -145,7 +145,7 @@
           <w:rFonts w:ascii="Times New Roman" w:hAnsi="Times New Roman" w:cs="Times New Roman"/>
           <w:lang w:val="tr-TR"/>
         </w:rPr>
-        <w:t xml:space="preserve">Arthur, Courtney, Joel Baker ve Holly Bamford, ed. Proceedings of the International Research Workshop on the Occurrence, Effects and Fate of Microplastic Marine Debris. NOAA Technical Memorandum NOS-OR&amp;R-30. Silver Spring, MD: NOAA, 2009.</w:t>
+        <w:t xml:space="preserve">European Chemicals Agency (ECHA). Annex XV Restriction Report: Proposal for a Restriction – Intentionally Added Microplastics. Version 1.2. Helsinki: ECHA, 2019.</w:t>
       </w:r>
     </w:p>
     <w:p>
@@ -166,28 +166,7 @@
           <w:rFonts w:ascii="Times New Roman" w:hAnsi="Times New Roman" w:cs="Times New Roman"/>
           <w:lang w:val="tr-TR"/>
         </w:rPr>
-        <w:t xml:space="preserve">European Chemicals Agency (ECHA). Annex XV Restriction Report: Proposal for a Restriction – Intentionally Added Microplastics. Helsinki: ECHA, 2019.</w:t>
-      </w:r>
-    </w:p>
-    <w:p>
-      <w:pPr>
-        <w:pStyle w:val="ListParagraph"/>
-        <w:numPr>
-          <w:ilvl w:val="0"/>
-          <w:numId w:val="51"/>
-        </w:numPr>
-        <w:jc w:val="both"/>
-        <w:rPr>
-          <w:rFonts w:ascii="Times New Roman" w:hAnsi="Times New Roman" w:cs="Times New Roman"/>
-          <w:lang w:val="tr-TR"/>
-        </w:rPr>
-      </w:pPr>
-      <w:r>
-        <w:rPr>
-          <w:rFonts w:ascii="Times New Roman" w:hAnsi="Times New Roman" w:cs="Times New Roman"/>
-          <w:lang w:val="tr-TR"/>
-        </w:rPr>
-        <w:t xml:space="preserve">Boucher, Julien ve Damien Friot. Primary Microplastics in the Oceans: A Global Evaluation of Sources. Gland, İsviçre: IUCN, 2017.</w:t>
+        <w:t xml:space="preserve">International Organization for Standardization. ISO 80004-1:2023 Nanotechnologies – Vocabulary – Part 1: Core Vocabulary. Cenevre: ISO, 2023.</w:t>
       </w:r>
     </w:p>
     <w:p>

</xml_diff>

<commit_message>
Kaynakcaya analitik kimya ve fizikokimya kitaplari eklendi
</commit_message>
<xml_diff>
--- a/kaynakca/Kimya11_kaynakca.docx
+++ b/kaynakca/Kimya11_kaynakca.docx
@@ -41,6 +41,132 @@
           <w:lang w:val="tr-TR"/>
         </w:rPr>
         <w:t xml:space="preserve">Petrucci, Ralph H., F. Geoffrey Herring, Jeffry D. Madura ve Carey Bissonnette. General Chemistry Principles and Modern Applications. Toronto: Pearson, 2011.</w:t>
+      </w:r>
+    </w:p>
+    <w:p>
+      <w:pPr>
+        <w:pStyle w:val="ListParagraph"/>
+        <w:numPr>
+          <w:ilvl w:val="0"/>
+          <w:numId w:val="51"/>
+        </w:numPr>
+        <w:jc w:val="both"/>
+        <w:rPr>
+          <w:rFonts w:ascii="Times New Roman" w:hAnsi="Times New Roman" w:cs="Times New Roman"/>
+          <w:lang w:val="tr-TR"/>
+        </w:rPr>
+      </w:pPr>
+      <w:r>
+        <w:rPr>
+          <w:rFonts w:ascii="Times New Roman" w:hAnsi="Times New Roman" w:cs="Times New Roman"/>
+          <w:lang w:val="tr-TR"/>
+        </w:rPr>
+        <w:t xml:space="preserve">Skoog, Douglas A., Donald M. West, F. James Holler ve Stanley R. Crouch. Fundamentals of Analytical Chemistry. 9th ed. Belmont, CA: Brooks/Cole, Cengage Learning, 2014.</w:t>
+      </w:r>
+    </w:p>
+    <w:p>
+      <w:pPr>
+        <w:pStyle w:val="ListParagraph"/>
+        <w:numPr>
+          <w:ilvl w:val="0"/>
+          <w:numId w:val="51"/>
+        </w:numPr>
+        <w:jc w:val="both"/>
+        <w:rPr>
+          <w:rFonts w:ascii="Times New Roman" w:hAnsi="Times New Roman" w:cs="Times New Roman"/>
+          <w:lang w:val="tr-TR"/>
+        </w:rPr>
+      </w:pPr>
+      <w:r>
+        <w:rPr>
+          <w:rFonts w:ascii="Times New Roman" w:hAnsi="Times New Roman" w:cs="Times New Roman"/>
+          <w:lang w:val="tr-TR"/>
+        </w:rPr>
+        <w:t xml:space="preserve">Atkins, Peter ve Julio de Paula. Physical Chemistry. 9th ed. New York: W. H. Freeman and Company, 2010.</w:t>
+      </w:r>
+    </w:p>
+    <w:p>
+      <w:pPr>
+        <w:pStyle w:val="ListParagraph"/>
+        <w:numPr>
+          <w:ilvl w:val="0"/>
+          <w:numId w:val="51"/>
+        </w:numPr>
+        <w:jc w:val="both"/>
+        <w:rPr>
+          <w:rFonts w:ascii="Times New Roman" w:hAnsi="Times New Roman" w:cs="Times New Roman"/>
+          <w:lang w:val="tr-TR"/>
+        </w:rPr>
+      </w:pPr>
+      <w:r>
+        <w:rPr>
+          <w:rFonts w:ascii="Times New Roman" w:hAnsi="Times New Roman" w:cs="Times New Roman"/>
+          <w:lang w:val="tr-TR"/>
+        </w:rPr>
+        <w:t xml:space="preserve">Atkins, Peter ve Julio de Paula. Fizikokimya. Dokuzuncu baskıdan çeviri. Çeviri ed. Esma Kılıç, Hamza Yılmaz ve Salih Yıldız. Ankara: Bilim Yayıncılık, 2013.</w:t>
+      </w:r>
+    </w:p>
+    <w:p>
+      <w:pPr>
+        <w:pStyle w:val="ListParagraph"/>
+        <w:numPr>
+          <w:ilvl w:val="0"/>
+          <w:numId w:val="51"/>
+        </w:numPr>
+        <w:jc w:val="both"/>
+        <w:rPr>
+          <w:rFonts w:ascii="Times New Roman" w:hAnsi="Times New Roman" w:cs="Times New Roman"/>
+          <w:lang w:val="tr-TR"/>
+        </w:rPr>
+      </w:pPr>
+      <w:r>
+        <w:rPr>
+          <w:rFonts w:ascii="Times New Roman" w:hAnsi="Times New Roman" w:cs="Times New Roman"/>
+          <w:lang w:val="tr-TR"/>
+        </w:rPr>
+        <w:t xml:space="preserve">Silbey, Robert J., Robert A. Alberty ve Moungi G. Bawendi. Physical Chemistry. 4th ed. Hoboken, NJ: John Wiley &amp; Sons, 2005.</w:t>
+      </w:r>
+    </w:p>
+    <w:p>
+      <w:pPr>
+        <w:pStyle w:val="ListParagraph"/>
+        <w:numPr>
+          <w:ilvl w:val="0"/>
+          <w:numId w:val="51"/>
+        </w:numPr>
+        <w:jc w:val="both"/>
+        <w:rPr>
+          <w:rFonts w:ascii="Times New Roman" w:hAnsi="Times New Roman" w:cs="Times New Roman"/>
+          <w:lang w:val="tr-TR"/>
+        </w:rPr>
+      </w:pPr>
+      <w:r>
+        <w:rPr>
+          <w:rFonts w:ascii="Times New Roman" w:hAnsi="Times New Roman" w:cs="Times New Roman"/>
+          <w:lang w:val="tr-TR"/>
+        </w:rPr>
+        <w:t xml:space="preserve">Levine, Ira N. Physical Chemistry. 6th ed. New York: McGraw-Hill, 2009.</w:t>
+      </w:r>
+    </w:p>
+    <w:p>
+      <w:pPr>
+        <w:pStyle w:val="ListParagraph"/>
+        <w:numPr>
+          <w:ilvl w:val="0"/>
+          <w:numId w:val="51"/>
+        </w:numPr>
+        <w:jc w:val="both"/>
+        <w:rPr>
+          <w:rFonts w:ascii="Times New Roman" w:hAnsi="Times New Roman" w:cs="Times New Roman"/>
+          <w:lang w:val="tr-TR"/>
+        </w:rPr>
+      </w:pPr>
+      <w:r>
+        <w:rPr>
+          <w:rFonts w:ascii="Times New Roman" w:hAnsi="Times New Roman" w:cs="Times New Roman"/>
+          <w:lang w:val="tr-TR"/>
+        </w:rPr>
+        <w:t xml:space="preserve">McQuarrie, Donald A. ve John D. Simon. Physical Chemistry: A Molecular Approach. Sausalito, CA: University Science Books, 1997.</w:t>
       </w:r>
     </w:p>
     <w:p>

</xml_diff>